<commit_message>
feat(contrato): exibir valor calculado de 10% da taxa de servico mensal nos templates
</commit_message>
<xml_diff>
--- a/src/templates/Termos garantia Doculoc 23.10.26 - Colina.docx
+++ b/src/templates/Termos garantia Doculoc 23.10.26 - Colina.docx
@@ -2595,34 +2595,8 @@
               <w:rPr>
                 <w:sz w:val="20"/>
               </w:rPr>
-              <w:t>1</w:t>
+              <w:t>10% valor do pacote ({monthlyServiceFee})</w:t>
             </w:r>
-            <w:r>
-              <w:rPr>
-                <w:sz w:val="20"/>
-              </w:rPr>
-              <w:t>0</w:t>
-            </w:r>
-            <w:r>
-              <w:rPr>
-                <w:sz w:val="20"/>
-              </w:rPr>
-              <w:t>%</w:t>
-            </w:r>
-            <w:r>
-              <w:rPr>
-                <w:sz w:val="20"/>
-              </w:rPr>
-              <w:t xml:space="preserve"> valor do </w:t>
-            </w:r>
-            <w:proofErr w:type="spellStart"/>
-            <w:r>
-              <w:rPr>
-                <w:sz w:val="20"/>
-              </w:rPr>
-              <w:t>pacote</w:t>
-            </w:r>
-            <w:proofErr w:type="spellEnd"/>
           </w:p>
         </w:tc>
       </w:tr>

</xml_diff>